<commit_message>
vault backup: 2026-05-01 08:45:32
</commit_message>
<xml_diff>
--- a/学校事务/企业级架构应用开发/草稿本.docx
+++ b/学校事务/企业级架构应用开发/草稿本.docx
@@ -2,8 +2,1204 @@
 <file path=word/document.xml><?xml version="1.0" encoding="utf-8"?>
 <w:document xmlns:w="http://schemas.openxmlformats.org/wordprocessingml/2006/main" xmlns:m="http://schemas.openxmlformats.org/officeDocument/2006/math" xmlns:r="http://schemas.openxmlformats.org/officeDocument/2006/relationships" xmlns:o="urn:schemas-microsoft-com:office:office" xmlns:v="urn:schemas-microsoft-com:vml" xmlns:w10="urn:schemas-microsoft-com:office:word" xmlns:a="http://schemas.openxmlformats.org/drawingml/2006/main" xmlns:pic="http://schemas.openxmlformats.org/drawingml/2006/picture" xmlns:wp="http://schemas.openxmlformats.org/drawingml/2006/wordprocessingDrawing">
   <w:body>
+    <w:bookmarkStart w:id="9" w:name="核心实体与属性设计"/>
     <w:p>
       <w:pPr>
+        <w:pStyle w:val="Heading3"/>
+      </w:pPr>
+      <w:r>
+        <w:t xml:space="preserve">1. </w:t>
+      </w:r>
+      <w:r>
+        <w:rPr>
+          <w:rFonts w:hint="eastAsia"/>
+        </w:rPr>
+        <w:t xml:space="preserve">核心实体与属性设计</w:t>
+      </w:r>
+    </w:p>
+    <w:p>
+      <w:pPr>
+        <w:pStyle w:val="FirstParagraph"/>
+      </w:pPr>
+      <w:r>
+        <w:rPr>
+          <w:rFonts w:hint="eastAsia"/>
+          <w:b/>
+          <w:bCs/>
+        </w:rPr>
+        <w:t xml:space="preserve">实体</w:t>
+      </w:r>
+      <w:r>
+        <w:rPr>
+          <w:b/>
+          <w:bCs/>
+        </w:rPr>
+        <w:t xml:space="preserve"> </w:t>
+      </w:r>
+      <w:r>
+        <w:rPr>
+          <w:rFonts w:hint="eastAsia"/>
+          <w:b/>
+          <w:bCs/>
+        </w:rPr>
+        <w:t xml:space="preserve">1：用户</w:t>
+      </w:r>
+      <w:r>
+        <w:rPr>
+          <w:b/>
+          <w:bCs/>
+        </w:rPr>
+        <w:t xml:space="preserve"> (User)</w:t>
+      </w:r>
+      <w:r>
+        <w:t xml:space="preserve"> </w:t>
+      </w:r>
+      <w:r>
+        <w:rPr>
+          <w:rFonts w:hint="eastAsia"/>
+        </w:rPr>
+        <w:t xml:space="preserve">系统的基本参与者，既可以发布需求，也可以接取任务。</w:t>
+      </w:r>
+    </w:p>
+    <w:p>
+      <w:pPr>
+        <w:numPr>
+          <w:ilvl w:val="0"/>
+          <w:numId w:val="1001"/>
+        </w:numPr>
+      </w:pPr>
+      <w:r>
+        <w:rPr>
+          <w:b/>
+          <w:bCs/>
+        </w:rPr>
+        <w:t xml:space="preserve">user_id</w:t>
+      </w:r>
+      <w:r>
+        <w:t xml:space="preserve"> </w:t>
+      </w:r>
+      <w:r>
+        <w:rPr>
+          <w:rFonts w:hint="eastAsia"/>
+        </w:rPr>
+        <w:t xml:space="preserve">(主键,</w:t>
+      </w:r>
+      <w:r>
+        <w:t xml:space="preserve"> Long)</w:t>
+      </w:r>
+    </w:p>
+    <w:p>
+      <w:pPr>
+        <w:numPr>
+          <w:ilvl w:val="0"/>
+          <w:numId w:val="1001"/>
+        </w:numPr>
+      </w:pPr>
+      <w:r>
+        <w:rPr>
+          <w:b/>
+          <w:bCs/>
+        </w:rPr>
+        <w:t xml:space="preserve">student_id</w:t>
+      </w:r>
+      <w:r>
+        <w:t xml:space="preserve"> </w:t>
+      </w:r>
+      <w:r>
+        <w:rPr>
+          <w:rFonts w:hint="eastAsia"/>
+        </w:rPr>
+        <w:t xml:space="preserve">(学号,</w:t>
+      </w:r>
+      <w:r>
+        <w:t xml:space="preserve"> </w:t>
+      </w:r>
+      <w:r>
+        <w:rPr>
+          <w:rFonts w:hint="eastAsia"/>
+        </w:rPr>
+        <w:t xml:space="preserve">Varchar，例如</w:t>
+      </w:r>
+      <w:r>
+        <w:t xml:space="preserve"> 11 </w:t>
+      </w:r>
+      <w:r>
+        <w:rPr>
+          <w:rFonts w:hint="eastAsia"/>
+        </w:rPr>
+        <w:t xml:space="preserve">位长度的校园一卡通号)</w:t>
+      </w:r>
+    </w:p>
+    <w:p>
+      <w:pPr>
+        <w:numPr>
+          <w:ilvl w:val="0"/>
+          <w:numId w:val="1001"/>
+        </w:numPr>
+      </w:pPr>
+      <w:r>
+        <w:rPr>
+          <w:b/>
+          <w:bCs/>
+        </w:rPr>
+        <w:t xml:space="preserve">nickname</w:t>
+      </w:r>
+      <w:r>
+        <w:t xml:space="preserve"> </w:t>
+      </w:r>
+      <w:r>
+        <w:rPr>
+          <w:rFonts w:hint="eastAsia"/>
+        </w:rPr>
+        <w:t xml:space="preserve">(昵称,</w:t>
+      </w:r>
+      <w:r>
+        <w:t xml:space="preserve"> Varchar)</w:t>
+      </w:r>
+    </w:p>
+    <w:p>
+      <w:pPr>
+        <w:numPr>
+          <w:ilvl w:val="0"/>
+          <w:numId w:val="1001"/>
+        </w:numPr>
+      </w:pPr>
+      <w:r>
+        <w:rPr>
+          <w:b/>
+          <w:bCs/>
+        </w:rPr>
+        <w:t xml:space="preserve">password_hash</w:t>
+      </w:r>
+      <w:r>
+        <w:t xml:space="preserve"> </w:t>
+      </w:r>
+      <w:r>
+        <w:rPr>
+          <w:rFonts w:hint="eastAsia"/>
+        </w:rPr>
+        <w:t xml:space="preserve">(密码哈希,</w:t>
+      </w:r>
+      <w:r>
+        <w:t xml:space="preserve"> Varchar)</w:t>
+      </w:r>
+    </w:p>
+    <w:p>
+      <w:pPr>
+        <w:numPr>
+          <w:ilvl w:val="0"/>
+          <w:numId w:val="1001"/>
+        </w:numPr>
+      </w:pPr>
+      <w:r>
+        <w:rPr>
+          <w:b/>
+          <w:bCs/>
+        </w:rPr>
+        <w:t xml:space="preserve">credit_score</w:t>
+      </w:r>
+      <w:r>
+        <w:t xml:space="preserve"> </w:t>
+      </w:r>
+      <w:r>
+        <w:rPr>
+          <w:rFonts w:hint="eastAsia"/>
+        </w:rPr>
+        <w:t xml:space="preserve">(信用分,</w:t>
+      </w:r>
+      <w:r>
+        <w:t xml:space="preserve"> </w:t>
+      </w:r>
+      <w:r>
+        <w:rPr>
+          <w:rFonts w:hint="eastAsia"/>
+        </w:rPr>
+        <w:t xml:space="preserve">Integer，初始</w:t>
+      </w:r>
+      <w:r>
+        <w:t xml:space="preserve"> 100 </w:t>
+      </w:r>
+      <w:r>
+        <w:rPr>
+          <w:rFonts w:hint="eastAsia"/>
+        </w:rPr>
+        <w:t xml:space="preserve">分，评价会影响此分数，低于某阈值无法接单)</w:t>
+      </w:r>
+    </w:p>
+    <w:p>
+      <w:pPr>
+        <w:numPr>
+          <w:ilvl w:val="0"/>
+          <w:numId w:val="1001"/>
+        </w:numPr>
+      </w:pPr>
+      <w:r>
+        <w:rPr>
+          <w:b/>
+          <w:bCs/>
+        </w:rPr>
+        <w:t xml:space="preserve">created_at</w:t>
+      </w:r>
+      <w:r>
+        <w:t xml:space="preserve"> </w:t>
+      </w:r>
+      <w:r>
+        <w:rPr>
+          <w:rFonts w:hint="eastAsia"/>
+        </w:rPr>
+        <w:t xml:space="preserve">(注册时间,</w:t>
+      </w:r>
+      <w:r>
+        <w:t xml:space="preserve"> DateTime)</w:t>
+      </w:r>
+    </w:p>
+    <w:p>
+      <w:pPr>
+        <w:pStyle w:val="FirstParagraph"/>
+      </w:pPr>
+      <w:r>
+        <w:rPr>
+          <w:rFonts w:hint="eastAsia"/>
+          <w:b/>
+          <w:bCs/>
+        </w:rPr>
+        <w:t xml:space="preserve">实体</w:t>
+      </w:r>
+      <w:r>
+        <w:rPr>
+          <w:b/>
+          <w:bCs/>
+        </w:rPr>
+        <w:t xml:space="preserve"> </w:t>
+      </w:r>
+      <w:r>
+        <w:rPr>
+          <w:rFonts w:hint="eastAsia"/>
+          <w:b/>
+          <w:bCs/>
+        </w:rPr>
+        <w:t xml:space="preserve">2：任务订单</w:t>
+      </w:r>
+      <w:r>
+        <w:rPr>
+          <w:b/>
+          <w:bCs/>
+        </w:rPr>
+        <w:t xml:space="preserve"> (Task)</w:t>
+      </w:r>
+      <w:r>
+        <w:t xml:space="preserve"> </w:t>
+      </w:r>
+      <w:r>
+        <w:rPr>
+          <w:rFonts w:hint="eastAsia"/>
+        </w:rPr>
+        <w:t xml:space="preserve">系统的核心流转对象，也是体现大语言模型处理能力的重点实体。</w:t>
+      </w:r>
+    </w:p>
+    <w:p>
+      <w:pPr>
+        <w:numPr>
+          <w:ilvl w:val="0"/>
+          <w:numId w:val="1002"/>
+        </w:numPr>
+      </w:pPr>
+      <w:r>
+        <w:rPr>
+          <w:b/>
+          <w:bCs/>
+        </w:rPr>
+        <w:t xml:space="preserve">task_id</w:t>
+      </w:r>
+      <w:r>
+        <w:t xml:space="preserve"> </w:t>
+      </w:r>
+      <w:r>
+        <w:rPr>
+          <w:rFonts w:hint="eastAsia"/>
+        </w:rPr>
+        <w:t xml:space="preserve">(主键,</w:t>
+      </w:r>
+      <w:r>
+        <w:t xml:space="preserve"> Long)</w:t>
+      </w:r>
+    </w:p>
+    <w:p>
+      <w:pPr>
+        <w:numPr>
+          <w:ilvl w:val="0"/>
+          <w:numId w:val="1002"/>
+        </w:numPr>
+      </w:pPr>
+      <w:r>
+        <w:rPr>
+          <w:b/>
+          <w:bCs/>
+        </w:rPr>
+        <w:t xml:space="preserve">publisher_id</w:t>
+      </w:r>
+      <w:r>
+        <w:t xml:space="preserve"> </w:t>
+      </w:r>
+      <w:r>
+        <w:rPr>
+          <w:rFonts w:hint="eastAsia"/>
+        </w:rPr>
+        <w:t xml:space="preserve">(发布者ID,</w:t>
+      </w:r>
+      <w:r>
+        <w:t xml:space="preserve"> </w:t>
+      </w:r>
+      <w:r>
+        <w:rPr>
+          <w:rFonts w:hint="eastAsia"/>
+        </w:rPr>
+        <w:t xml:space="preserve">外键关联</w:t>
+      </w:r>
+      <w:r>
+        <w:t xml:space="preserve"> User)</w:t>
+      </w:r>
+    </w:p>
+    <w:p>
+      <w:pPr>
+        <w:numPr>
+          <w:ilvl w:val="0"/>
+          <w:numId w:val="1002"/>
+        </w:numPr>
+      </w:pPr>
+      <w:r>
+        <w:rPr>
+          <w:b/>
+          <w:bCs/>
+        </w:rPr>
+        <w:t xml:space="preserve">accepter_id</w:t>
+      </w:r>
+      <w:r>
+        <w:t xml:space="preserve"> </w:t>
+      </w:r>
+      <w:r>
+        <w:rPr>
+          <w:rFonts w:hint="eastAsia"/>
+        </w:rPr>
+        <w:t xml:space="preserve">(接单者ID,</w:t>
+      </w:r>
+      <w:r>
+        <w:t xml:space="preserve"> </w:t>
+      </w:r>
+      <w:r>
+        <w:rPr>
+          <w:rFonts w:hint="eastAsia"/>
+        </w:rPr>
+        <w:t xml:space="preserve">外键关联</w:t>
+      </w:r>
+      <w:r>
+        <w:t xml:space="preserve"> </w:t>
+      </w:r>
+      <w:r>
+        <w:rPr>
+          <w:rFonts w:hint="eastAsia"/>
+        </w:rPr>
+        <w:t xml:space="preserve">User，初始允许为空)</w:t>
+      </w:r>
+    </w:p>
+    <w:p>
+      <w:pPr>
+        <w:numPr>
+          <w:ilvl w:val="0"/>
+          <w:numId w:val="1002"/>
+        </w:numPr>
+      </w:pPr>
+      <w:r>
+        <w:rPr>
+          <w:b/>
+          <w:bCs/>
+        </w:rPr>
+        <w:t xml:space="preserve">raw_content</w:t>
+      </w:r>
+      <w:r>
+        <w:t xml:space="preserve"> </w:t>
+      </w:r>
+      <w:r>
+        <w:rPr>
+          <w:rFonts w:hint="eastAsia"/>
+        </w:rPr>
+        <w:t xml:space="preserve">(原始文本,</w:t>
+      </w:r>
+      <w:r>
+        <w:t xml:space="preserve"> </w:t>
+      </w:r>
+      <w:r>
+        <w:rPr>
+          <w:rFonts w:hint="eastAsia"/>
+        </w:rPr>
+        <w:t xml:space="preserve">Text，用户输入的非结构化自然语言描述，如“明天下午三点求人拿快递”)</w:t>
+      </w:r>
+    </w:p>
+    <w:p>
+      <w:pPr>
+        <w:numPr>
+          <w:ilvl w:val="0"/>
+          <w:numId w:val="1002"/>
+        </w:numPr>
+      </w:pPr>
+      <w:r>
+        <w:rPr>
+          <w:b/>
+          <w:bCs/>
+        </w:rPr>
+        <w:t xml:space="preserve">ai_parsed_data</w:t>
+      </w:r>
+      <w:r>
+        <w:t xml:space="preserve"> </w:t>
+      </w:r>
+      <w:r>
+        <w:rPr>
+          <w:rFonts w:hint="eastAsia"/>
+        </w:rPr>
+        <w:t xml:space="preserve">(AI解析结果,</w:t>
+      </w:r>
+      <w:r>
+        <w:t xml:space="preserve"> </w:t>
+      </w:r>
+      <w:r>
+        <w:rPr>
+          <w:rFonts w:hint="eastAsia"/>
+        </w:rPr>
+        <w:t xml:space="preserve">JSON，存储本地大模型提取出的结构化字段集合，如确切时间、地点、物品分类等)</w:t>
+      </w:r>
+    </w:p>
+    <w:p>
+      <w:pPr>
+        <w:numPr>
+          <w:ilvl w:val="0"/>
+          <w:numId w:val="1002"/>
+        </w:numPr>
+      </w:pPr>
+      <w:r>
+        <w:rPr>
+          <w:b/>
+          <w:bCs/>
+        </w:rPr>
+        <w:t xml:space="preserve">reward_amount</w:t>
+      </w:r>
+      <w:r>
+        <w:t xml:space="preserve"> </w:t>
+      </w:r>
+      <w:r>
+        <w:rPr>
+          <w:rFonts w:hint="eastAsia"/>
+        </w:rPr>
+        <w:t xml:space="preserve">(报酬金额,</w:t>
+      </w:r>
+      <w:r>
+        <w:t xml:space="preserve"> Decimal)</w:t>
+      </w:r>
+    </w:p>
+    <w:p>
+      <w:pPr>
+        <w:numPr>
+          <w:ilvl w:val="0"/>
+          <w:numId w:val="1002"/>
+        </w:numPr>
+      </w:pPr>
+      <w:r>
+        <w:rPr>
+          <w:b/>
+          <w:bCs/>
+        </w:rPr>
+        <w:t xml:space="preserve">status</w:t>
+      </w:r>
+      <w:r>
+        <w:t xml:space="preserve"> </w:t>
+      </w:r>
+      <w:r>
+        <w:rPr>
+          <w:rFonts w:hint="eastAsia"/>
+        </w:rPr>
+        <w:t xml:space="preserve">(任务状态,</w:t>
+      </w:r>
+      <w:r>
+        <w:t xml:space="preserve"> </w:t>
+      </w:r>
+      <w:r>
+        <w:rPr>
+          <w:rFonts w:hint="eastAsia"/>
+        </w:rPr>
+        <w:t xml:space="preserve">Integer/Enum，如：0-待接单，1-进行中，2-待确认，3-已完成，4-已取消)</w:t>
+      </w:r>
+    </w:p>
+    <w:p>
+      <w:pPr>
+        <w:numPr>
+          <w:ilvl w:val="0"/>
+          <w:numId w:val="1002"/>
+        </w:numPr>
+      </w:pPr>
+      <w:r>
+        <w:rPr>
+          <w:b/>
+          <w:bCs/>
+        </w:rPr>
+        <w:t xml:space="preserve">created_at</w:t>
+      </w:r>
+      <w:r>
+        <w:t xml:space="preserve"> </w:t>
+      </w:r>
+      <w:r>
+        <w:rPr>
+          <w:rFonts w:hint="eastAsia"/>
+        </w:rPr>
+        <w:t xml:space="preserve">(发布时间,</w:t>
+      </w:r>
+      <w:r>
+        <w:t xml:space="preserve"> DateTime)</w:t>
+      </w:r>
+    </w:p>
+    <w:p>
+      <w:pPr>
+        <w:numPr>
+          <w:ilvl w:val="0"/>
+          <w:numId w:val="1002"/>
+        </w:numPr>
+      </w:pPr>
+      <w:r>
+        <w:rPr>
+          <w:b/>
+          <w:bCs/>
+        </w:rPr>
+        <w:t xml:space="preserve">updated_at</w:t>
+      </w:r>
+      <w:r>
+        <w:t xml:space="preserve"> </w:t>
+      </w:r>
+      <w:r>
+        <w:rPr>
+          <w:rFonts w:hint="eastAsia"/>
+        </w:rPr>
+        <w:t xml:space="preserve">(状态更新时间,</w:t>
+      </w:r>
+      <w:r>
+        <w:t xml:space="preserve"> DateTime)</w:t>
+      </w:r>
+    </w:p>
+    <w:p>
+      <w:pPr>
+        <w:pStyle w:val="FirstParagraph"/>
+      </w:pPr>
+      <w:r>
+        <w:rPr>
+          <w:rFonts w:hint="eastAsia"/>
+          <w:b/>
+          <w:bCs/>
+        </w:rPr>
+        <w:t xml:space="preserve">实体</w:t>
+      </w:r>
+      <w:r>
+        <w:rPr>
+          <w:b/>
+          <w:bCs/>
+        </w:rPr>
+        <w:t xml:space="preserve"> </w:t>
+      </w:r>
+      <w:r>
+        <w:rPr>
+          <w:rFonts w:hint="eastAsia"/>
+          <w:b/>
+          <w:bCs/>
+        </w:rPr>
+        <w:t xml:space="preserve">3：评价</w:t>
+      </w:r>
+      <w:r>
+        <w:rPr>
+          <w:b/>
+          <w:bCs/>
+        </w:rPr>
+        <w:t xml:space="preserve"> (Review)</w:t>
+      </w:r>
+      <w:r>
+        <w:t xml:space="preserve"> </w:t>
+      </w:r>
+      <w:r>
+        <w:rPr>
+          <w:rFonts w:hint="eastAsia"/>
+        </w:rPr>
+        <w:t xml:space="preserve">任务完成后的信用闭环实体。</w:t>
+      </w:r>
+    </w:p>
+    <w:p>
+      <w:pPr>
+        <w:numPr>
+          <w:ilvl w:val="0"/>
+          <w:numId w:val="1003"/>
+        </w:numPr>
+      </w:pPr>
+      <w:r>
+        <w:rPr>
+          <w:b/>
+          <w:bCs/>
+        </w:rPr>
+        <w:t xml:space="preserve">review_id</w:t>
+      </w:r>
+      <w:r>
+        <w:t xml:space="preserve"> </w:t>
+      </w:r>
+      <w:r>
+        <w:rPr>
+          <w:rFonts w:hint="eastAsia"/>
+        </w:rPr>
+        <w:t xml:space="preserve">(主键,</w:t>
+      </w:r>
+      <w:r>
+        <w:t xml:space="preserve"> Long)</w:t>
+      </w:r>
+    </w:p>
+    <w:p>
+      <w:pPr>
+        <w:numPr>
+          <w:ilvl w:val="0"/>
+          <w:numId w:val="1003"/>
+        </w:numPr>
+      </w:pPr>
+      <w:r>
+        <w:rPr>
+          <w:b/>
+          <w:bCs/>
+        </w:rPr>
+        <w:t xml:space="preserve">task_id</w:t>
+      </w:r>
+      <w:r>
+        <w:t xml:space="preserve"> </w:t>
+      </w:r>
+      <w:r>
+        <w:rPr>
+          <w:rFonts w:hint="eastAsia"/>
+        </w:rPr>
+        <w:t xml:space="preserve">(关联任务ID,</w:t>
+      </w:r>
+      <w:r>
+        <w:t xml:space="preserve"> </w:t>
+      </w:r>
+      <w:r>
+        <w:rPr>
+          <w:rFonts w:hint="eastAsia"/>
+        </w:rPr>
+        <w:t xml:space="preserve">外键关联</w:t>
+      </w:r>
+      <w:r>
+        <w:t xml:space="preserve"> Task)</w:t>
+      </w:r>
+    </w:p>
+    <w:p>
+      <w:pPr>
+        <w:numPr>
+          <w:ilvl w:val="0"/>
+          <w:numId w:val="1003"/>
+        </w:numPr>
+      </w:pPr>
+      <w:r>
+        <w:rPr>
+          <w:b/>
+          <w:bCs/>
+        </w:rPr>
+        <w:t xml:space="preserve">reviewer_id</w:t>
+      </w:r>
+      <w:r>
+        <w:t xml:space="preserve"> </w:t>
+      </w:r>
+      <w:r>
+        <w:rPr>
+          <w:rFonts w:hint="eastAsia"/>
+        </w:rPr>
+        <w:t xml:space="preserve">(评价方ID,</w:t>
+      </w:r>
+      <w:r>
+        <w:t xml:space="preserve"> </w:t>
+      </w:r>
+      <w:r>
+        <w:rPr>
+          <w:rFonts w:hint="eastAsia"/>
+        </w:rPr>
+        <w:t xml:space="preserve">外键关联</w:t>
+      </w:r>
+      <w:r>
+        <w:t xml:space="preserve"> User)</w:t>
+      </w:r>
+    </w:p>
+    <w:p>
+      <w:pPr>
+        <w:numPr>
+          <w:ilvl w:val="0"/>
+          <w:numId w:val="1003"/>
+        </w:numPr>
+      </w:pPr>
+      <w:r>
+        <w:rPr>
+          <w:b/>
+          <w:bCs/>
+        </w:rPr>
+        <w:t xml:space="preserve">reviewee_id</w:t>
+      </w:r>
+      <w:r>
+        <w:t xml:space="preserve"> </w:t>
+      </w:r>
+      <w:r>
+        <w:rPr>
+          <w:rFonts w:hint="eastAsia"/>
+        </w:rPr>
+        <w:t xml:space="preserve">(被评价方ID,</w:t>
+      </w:r>
+      <w:r>
+        <w:t xml:space="preserve"> </w:t>
+      </w:r>
+      <w:r>
+        <w:rPr>
+          <w:rFonts w:hint="eastAsia"/>
+        </w:rPr>
+        <w:t xml:space="preserve">外键关联</w:t>
+      </w:r>
+      <w:r>
+        <w:t xml:space="preserve"> User)</w:t>
+      </w:r>
+    </w:p>
+    <w:p>
+      <w:pPr>
+        <w:numPr>
+          <w:ilvl w:val="0"/>
+          <w:numId w:val="1003"/>
+        </w:numPr>
+      </w:pPr>
+      <w:r>
+        <w:rPr>
+          <w:b/>
+          <w:bCs/>
+        </w:rPr>
+        <w:t xml:space="preserve">rating</w:t>
+      </w:r>
+      <w:r>
+        <w:t xml:space="preserve"> </w:t>
+      </w:r>
+      <w:r>
+        <w:rPr>
+          <w:rFonts w:hint="eastAsia"/>
+        </w:rPr>
+        <w:t xml:space="preserve">(评分,</w:t>
+      </w:r>
+      <w:r>
+        <w:t xml:space="preserve"> </w:t>
+      </w:r>
+      <w:r>
+        <w:rPr>
+          <w:rFonts w:hint="eastAsia"/>
+        </w:rPr>
+        <w:t xml:space="preserve">Integer，1-5分)</w:t>
+      </w:r>
+    </w:p>
+    <w:p>
+      <w:pPr>
+        <w:numPr>
+          <w:ilvl w:val="0"/>
+          <w:numId w:val="1003"/>
+        </w:numPr>
+      </w:pPr>
+      <w:r>
+        <w:rPr>
+          <w:b/>
+          <w:bCs/>
+        </w:rPr>
+        <w:t xml:space="preserve">comment</w:t>
+      </w:r>
+      <w:r>
+        <w:t xml:space="preserve"> </w:t>
+      </w:r>
+      <w:r>
+        <w:rPr>
+          <w:rFonts w:hint="eastAsia"/>
+        </w:rPr>
+        <w:t xml:space="preserve">(文字评价,</w:t>
+      </w:r>
+      <w:r>
+        <w:t xml:space="preserve"> Varchar)</w:t>
+      </w:r>
+    </w:p>
+    <w:p>
+      <w:pPr>
+        <w:numPr>
+          <w:ilvl w:val="0"/>
+          <w:numId w:val="1003"/>
+        </w:numPr>
+      </w:pPr>
+      <w:r>
+        <w:rPr>
+          <w:b/>
+          <w:bCs/>
+        </w:rPr>
+        <w:t xml:space="preserve">created_at</w:t>
+      </w:r>
+      <w:r>
+        <w:t xml:space="preserve"> </w:t>
+      </w:r>
+      <w:r>
+        <w:rPr>
+          <w:rFonts w:hint="eastAsia"/>
+        </w:rPr>
+        <w:t xml:space="preserve">(评价时间,</w:t>
+      </w:r>
+      <w:r>
+        <w:t xml:space="preserve"> DateTime)</w:t>
+      </w:r>
+    </w:p>
+    <w:bookmarkEnd w:id="9"/>
+    <w:bookmarkStart w:id="10" w:name="实体间的关系-relationships"/>
+    <w:p>
+      <w:pPr>
+        <w:pStyle w:val="Heading3"/>
+      </w:pPr>
+      <w:r>
+        <w:t xml:space="preserve">2. </w:t>
+      </w:r>
+      <w:r>
+        <w:rPr>
+          <w:rFonts w:hint="eastAsia"/>
+        </w:rPr>
+        <w:t xml:space="preserve">实体间的关系</w:t>
+      </w:r>
+      <w:r>
+        <w:t xml:space="preserve"> (Relationships)</w:t>
+      </w:r>
+    </w:p>
+    <w:p>
+      <w:pPr>
+        <w:pStyle w:val="FirstParagraph"/>
+      </w:pPr>
+      <w:r>
+        <w:rPr>
+          <w:rFonts w:hint="eastAsia"/>
+        </w:rPr>
+        <w:t xml:space="preserve">在绘制</w:t>
+      </w:r>
+      <w:r>
+        <w:t xml:space="preserve"> ER </w:t>
+      </w:r>
+      <w:r>
+        <w:rPr>
+          <w:rFonts w:hint="eastAsia"/>
+        </w:rPr>
+        <w:t xml:space="preserve">图的菱形（关系）时，可以这样梳理流转逻辑：</w:t>
+      </w:r>
+    </w:p>
+    <w:p>
+      <w:pPr>
+        <w:numPr>
+          <w:ilvl w:val="0"/>
+          <w:numId w:val="1004"/>
+        </w:numPr>
+      </w:pPr>
+      <w:r>
+        <w:rPr>
+          <w:rFonts w:hint="eastAsia"/>
+          <w:b/>
+          <w:bCs/>
+        </w:rPr>
+        <w:t xml:space="preserve">发布</w:t>
+      </w:r>
+      <w:r>
+        <w:rPr>
+          <w:b/>
+          <w:bCs/>
+        </w:rPr>
+        <w:t xml:space="preserve"> (Publish)</w:t>
+      </w:r>
+      <w:r>
+        <w:rPr>
+          <w:rFonts w:hint="eastAsia"/>
+        </w:rPr>
+        <w:t xml:space="preserve">：</w:t>
+      </w:r>
+      <w:r>
+        <w:rPr>
+          <w:rStyle w:val="VerbatimChar"/>
+        </w:rPr>
+        <w:t xml:space="preserve">User</w:t>
+      </w:r>
+      <w:r>
+        <w:t xml:space="preserve"> </w:t>
+      </w:r>
+      <w:r>
+        <w:rPr>
+          <w:rFonts w:hint="eastAsia"/>
+        </w:rPr>
+        <w:t xml:space="preserve">与</w:t>
+      </w:r>
+      <w:r>
+        <w:t xml:space="preserve"> </w:t>
+      </w:r>
+      <w:r>
+        <w:rPr>
+          <w:rStyle w:val="VerbatimChar"/>
+        </w:rPr>
+        <w:t xml:space="preserve">Task</w:t>
+      </w:r>
+      <w:r>
+        <w:t xml:space="preserve"> </w:t>
+      </w:r>
+      <w:r>
+        <w:rPr>
+          <w:rFonts w:hint="eastAsia"/>
+        </w:rPr>
+        <w:t xml:space="preserve">之间是</w:t>
+      </w:r>
+      <w:r>
+        <w:t xml:space="preserve"> </w:t>
+      </w:r>
+      <w:r>
+        <w:rPr>
+          <w:b/>
+          <w:bCs/>
+        </w:rPr>
+        <w:t xml:space="preserve">1:N</w:t>
+      </w:r>
+      <w:r>
+        <w:t xml:space="preserve"> </w:t>
+      </w:r>
+      <w:r>
+        <w:rPr>
+          <w:rFonts w:hint="eastAsia"/>
+        </w:rPr>
+        <w:t xml:space="preserve">的关系。一个用户可以发布多个任务。</w:t>
+      </w:r>
+    </w:p>
+    <w:p>
+      <w:pPr>
+        <w:numPr>
+          <w:ilvl w:val="0"/>
+          <w:numId w:val="1004"/>
+        </w:numPr>
+      </w:pPr>
+      <w:r>
+        <w:rPr>
+          <w:rFonts w:hint="eastAsia"/>
+          <w:b/>
+          <w:bCs/>
+        </w:rPr>
+        <w:t xml:space="preserve">接单</w:t>
+      </w:r>
+      <w:r>
+        <w:rPr>
+          <w:b/>
+          <w:bCs/>
+        </w:rPr>
+        <w:t xml:space="preserve"> (Accept)</w:t>
+      </w:r>
+      <w:r>
+        <w:rPr>
+          <w:rFonts w:hint="eastAsia"/>
+        </w:rPr>
+        <w:t xml:space="preserve">：</w:t>
+      </w:r>
+      <w:r>
+        <w:rPr>
+          <w:rStyle w:val="VerbatimChar"/>
+        </w:rPr>
+        <w:t xml:space="preserve">User</w:t>
+      </w:r>
+      <w:r>
+        <w:t xml:space="preserve"> </w:t>
+      </w:r>
+      <w:r>
+        <w:rPr>
+          <w:rFonts w:hint="eastAsia"/>
+        </w:rPr>
+        <w:t xml:space="preserve">与</w:t>
+      </w:r>
+      <w:r>
+        <w:t xml:space="preserve"> </w:t>
+      </w:r>
+      <w:r>
+        <w:rPr>
+          <w:rStyle w:val="VerbatimChar"/>
+        </w:rPr>
+        <w:t xml:space="preserve">Task</w:t>
+      </w:r>
+      <w:r>
+        <w:t xml:space="preserve"> </w:t>
+      </w:r>
+      <w:r>
+        <w:rPr>
+          <w:rFonts w:hint="eastAsia"/>
+        </w:rPr>
+        <w:t xml:space="preserve">之间也是</w:t>
+      </w:r>
+      <w:r>
+        <w:t xml:space="preserve"> </w:t>
+      </w:r>
+      <w:r>
+        <w:rPr>
+          <w:b/>
+          <w:bCs/>
+        </w:rPr>
+        <w:t xml:space="preserve">1:N</w:t>
+      </w:r>
+      <w:r>
+        <w:t xml:space="preserve"> </w:t>
+      </w:r>
+      <w:r>
+        <w:rPr>
+          <w:rFonts w:hint="eastAsia"/>
+        </w:rPr>
+        <w:t xml:space="preserve">的关系。一个用户可以接取多个任务。</w:t>
+      </w:r>
+    </w:p>
+    <w:p>
+      <w:pPr>
+        <w:numPr>
+          <w:ilvl w:val="0"/>
+          <w:numId w:val="1004"/>
+        </w:numPr>
+      </w:pPr>
+      <w:r>
+        <w:rPr>
+          <w:rFonts w:hint="eastAsia"/>
+          <w:b/>
+          <w:bCs/>
+        </w:rPr>
+        <w:t xml:space="preserve">评价</w:t>
+      </w:r>
+      <w:r>
+        <w:rPr>
+          <w:b/>
+          <w:bCs/>
+        </w:rPr>
+        <w:t xml:space="preserve"> (Evaluate)</w:t>
+      </w:r>
+      <w:r>
+        <w:rPr>
+          <w:rFonts w:hint="eastAsia"/>
+        </w:rPr>
+        <w:t xml:space="preserve">：</w:t>
+      </w:r>
+      <w:r>
+        <w:rPr>
+          <w:rStyle w:val="VerbatimChar"/>
+        </w:rPr>
+        <w:t xml:space="preserve">Task</w:t>
+      </w:r>
+      <w:r>
+        <w:t xml:space="preserve"> </w:t>
+      </w:r>
+      <w:r>
+        <w:rPr>
+          <w:rFonts w:hint="eastAsia"/>
+        </w:rPr>
+        <w:t xml:space="preserve">与</w:t>
+      </w:r>
+      <w:r>
+        <w:t xml:space="preserve"> </w:t>
+      </w:r>
+      <w:r>
+        <w:rPr>
+          <w:rStyle w:val="VerbatimChar"/>
+        </w:rPr>
+        <w:t xml:space="preserve">Review</w:t>
+      </w:r>
+      <w:r>
+        <w:t xml:space="preserve"> </w:t>
+      </w:r>
+      <w:r>
+        <w:rPr>
+          <w:rFonts w:hint="eastAsia"/>
+        </w:rPr>
+        <w:t xml:space="preserve">之间通常是</w:t>
+      </w:r>
+      <w:r>
+        <w:t xml:space="preserve"> </w:t>
+      </w:r>
+      <w:r>
+        <w:rPr>
+          <w:b/>
+          <w:bCs/>
+        </w:rPr>
+        <w:t xml:space="preserve">1:1</w:t>
+      </w:r>
+      <w:r>
+        <w:t xml:space="preserve"> </w:t>
+      </w:r>
+      <w:r>
+        <w:rPr>
+          <w:rFonts w:hint="eastAsia"/>
+        </w:rPr>
+        <w:t xml:space="preserve">或</w:t>
+      </w:r>
+      <w:r>
+        <w:t xml:space="preserve"> </w:t>
+      </w:r>
+      <w:r>
+        <w:rPr>
+          <w:b/>
+          <w:bCs/>
+        </w:rPr>
+        <w:t xml:space="preserve">1:2</w:t>
+      </w:r>
+      <w:r>
+        <w:rPr>
+          <w:rFonts w:hint="eastAsia"/>
+        </w:rPr>
+        <w:t xml:space="preserve">（如果设计为双向互评）。</w:t>
+      </w:r>
+      <w:r>
+        <w:rPr>
+          <w:rStyle w:val="VerbatimChar"/>
+        </w:rPr>
+        <w:t xml:space="preserve">User</w:t>
+      </w:r>
+      <w:r>
+        <w:t xml:space="preserve"> </w:t>
+      </w:r>
+      <w:r>
+        <w:rPr>
+          <w:rFonts w:hint="eastAsia"/>
+        </w:rPr>
+        <w:t xml:space="preserve">与</w:t>
+      </w:r>
+      <w:r>
+        <w:t xml:space="preserve"> </w:t>
+      </w:r>
+      <w:r>
+        <w:rPr>
+          <w:rStyle w:val="VerbatimChar"/>
+        </w:rPr>
+        <w:t xml:space="preserve">Review</w:t>
+      </w:r>
+      <w:r>
+        <w:t xml:space="preserve"> </w:t>
+      </w:r>
+      <w:r>
+        <w:rPr>
+          <w:rFonts w:hint="eastAsia"/>
+        </w:rPr>
+        <w:t xml:space="preserve">是</w:t>
+      </w:r>
+      <w:r>
+        <w:t xml:space="preserve"> </w:t>
+      </w:r>
+      <w:r>
+        <w:rPr>
+          <w:b/>
+          <w:bCs/>
+        </w:rPr>
+        <w:t xml:space="preserve">1:N</w:t>
+      </w:r>
+      <w:r>
+        <w:t xml:space="preserve"> </w:t>
+      </w:r>
+      <w:r>
+        <w:rPr>
+          <w:rFonts w:hint="eastAsia"/>
+        </w:rPr>
+        <w:t xml:space="preserve">的关系。</w:t>
+      </w:r>
+    </w:p>
+    <w:p>
+      <w:pPr>
         <w:pStyle w:val="SourceCode"/>
       </w:pPr>
       <w:r>
@@ -526,6 +1722,614 @@
         <w:t xml:space="preserve">"收到评价"</w:t>
       </w:r>
     </w:p>
+    <w:bookmarkEnd w:id="10"/>
+    <w:bookmarkStart w:id="11" w:name="核心-prompt-逻辑设计"/>
+    <w:p>
+      <w:pPr>
+        <w:pStyle w:val="Heading3"/>
+      </w:pPr>
+      <w:r>
+        <w:rPr>
+          <w:rFonts w:hint="eastAsia"/>
+        </w:rPr>
+        <w:t xml:space="preserve">核心</w:t>
+      </w:r>
+      <w:r>
+        <w:t xml:space="preserve"> Prompt </w:t>
+      </w:r>
+      <w:r>
+        <w:rPr>
+          <w:rFonts w:hint="eastAsia"/>
+        </w:rPr>
+        <w:t xml:space="preserve">逻辑设计</w:t>
+      </w:r>
+    </w:p>
+    <w:p>
+      <w:pPr>
+        <w:pStyle w:val="SourceCode"/>
+      </w:pPr>
+      <w:r>
+        <w:rPr>
+          <w:rStyle w:val="VerbatimChar"/>
+        </w:rPr>
+        <w:t xml:space="preserve"># Role</w:t>
+      </w:r>
+      <w:r>
+        <w:br/>
+      </w:r>
+      <w:r>
+        <w:rPr>
+          <w:rStyle w:val="VerbatimChar"/>
+          <w:rFonts w:hint="eastAsia"/>
+        </w:rPr>
+        <w:t xml:space="preserve">你是一个校园帮办平台的智能意图识别引擎。你的任务是从用户的自然语言输入中，精准提取关键任务实体，并严格输出为</w:t>
+      </w:r>
+      <w:r>
+        <w:rPr>
+          <w:rStyle w:val="VerbatimChar"/>
+        </w:rPr>
+        <w:t xml:space="preserve"> JSON </w:t>
+      </w:r>
+      <w:r>
+        <w:rPr>
+          <w:rStyle w:val="VerbatimChar"/>
+          <w:rFonts w:hint="eastAsia"/>
+        </w:rPr>
+        <w:t xml:space="preserve">格式。</w:t>
+      </w:r>
+      <w:r>
+        <w:br/>
+      </w:r>
+      <w:r>
+        <w:br/>
+      </w:r>
+      <w:r>
+        <w:rPr>
+          <w:rStyle w:val="VerbatimChar"/>
+        </w:rPr>
+        <w:t xml:space="preserve"># Constraints</w:t>
+      </w:r>
+      <w:r>
+        <w:br/>
+      </w:r>
+      <w:r>
+        <w:rPr>
+          <w:rStyle w:val="VerbatimChar"/>
+        </w:rPr>
+        <w:t xml:space="preserve">1. </w:t>
+      </w:r>
+      <w:r>
+        <w:rPr>
+          <w:rStyle w:val="VerbatimChar"/>
+          <w:rFonts w:hint="eastAsia"/>
+        </w:rPr>
+        <w:t xml:space="preserve">必须且只能输出合法的</w:t>
+      </w:r>
+      <w:r>
+        <w:rPr>
+          <w:rStyle w:val="VerbatimChar"/>
+        </w:rPr>
+        <w:t xml:space="preserve"> JSON </w:t>
+      </w:r>
+      <w:r>
+        <w:rPr>
+          <w:rStyle w:val="VerbatimChar"/>
+          <w:rFonts w:hint="eastAsia"/>
+        </w:rPr>
+        <w:t xml:space="preserve">字符串，绝对不要包含任何前缀、后缀、解释性文本，也不要使用</w:t>
+      </w:r>
+      <w:r>
+        <w:rPr>
+          <w:rStyle w:val="VerbatimChar"/>
+        </w:rPr>
+        <w:t xml:space="preserve"> Markdown </w:t>
+      </w:r>
+      <w:r>
+        <w:rPr>
+          <w:rStyle w:val="VerbatimChar"/>
+          <w:rFonts w:hint="eastAsia"/>
+        </w:rPr>
+        <w:t xml:space="preserve">的</w:t>
+      </w:r>
+      <w:r>
+        <w:rPr>
+          <w:rStyle w:val="VerbatimChar"/>
+        </w:rPr>
+        <w:t xml:space="preserve"> ```json </w:t>
+      </w:r>
+      <w:r>
+        <w:rPr>
+          <w:rStyle w:val="VerbatimChar"/>
+          <w:rFonts w:hint="eastAsia"/>
+        </w:rPr>
+        <w:t xml:space="preserve">代码块包裹。</w:t>
+      </w:r>
+      <w:r>
+        <w:br/>
+      </w:r>
+      <w:r>
+        <w:rPr>
+          <w:rStyle w:val="VerbatimChar"/>
+        </w:rPr>
+        <w:t xml:space="preserve">2. </w:t>
+      </w:r>
+      <w:r>
+        <w:rPr>
+          <w:rStyle w:val="VerbatimChar"/>
+          <w:rFonts w:hint="eastAsia"/>
+        </w:rPr>
+        <w:t xml:space="preserve">如果用户没有提供某个字段的信息，请将该字段的值设为</w:t>
+      </w:r>
+      <w:r>
+        <w:rPr>
+          <w:rStyle w:val="VerbatimChar"/>
+        </w:rPr>
+        <w:t xml:space="preserve"> </w:t>
+      </w:r>
+      <w:r>
+        <w:rPr>
+          <w:rStyle w:val="VerbatimChar"/>
+          <w:rFonts w:hint="eastAsia"/>
+        </w:rPr>
+        <w:t xml:space="preserve">null，不要自行捏造。</w:t>
+      </w:r>
+      <w:r>
+        <w:br/>
+      </w:r>
+      <w:r>
+        <w:rPr>
+          <w:rStyle w:val="VerbatimChar"/>
+        </w:rPr>
+        <w:t xml:space="preserve">3. "reward" </w:t>
+      </w:r>
+      <w:r>
+        <w:rPr>
+          <w:rStyle w:val="VerbatimChar"/>
+          <w:rFonts w:hint="eastAsia"/>
+        </w:rPr>
+        <w:t xml:space="preserve">字段只能提取纯数字（如有小数点保留两位），去掉“元”、“块”等单位。</w:t>
+      </w:r>
+      <w:r>
+        <w:br/>
+      </w:r>
+      <w:r>
+        <w:br/>
+      </w:r>
+      <w:r>
+        <w:rPr>
+          <w:rStyle w:val="VerbatimChar"/>
+        </w:rPr>
+        <w:t xml:space="preserve"># Output Schema</w:t>
+      </w:r>
+      <w:r>
+        <w:br/>
+      </w:r>
+      <w:r>
+        <w:rPr>
+          <w:rStyle w:val="VerbatimChar"/>
+        </w:rPr>
+        <w:t xml:space="preserve">{</w:t>
+      </w:r>
+      <w:r>
+        <w:br/>
+      </w:r>
+      <w:r>
+        <w:rPr>
+          <w:rStyle w:val="VerbatimChar"/>
+        </w:rPr>
+        <w:t xml:space="preserve">  "time": </w:t>
+      </w:r>
+      <w:r>
+        <w:rPr>
+          <w:rStyle w:val="VerbatimChar"/>
+          <w:rFonts w:hint="eastAsia"/>
+        </w:rPr>
+        <w:t xml:space="preserve">"任务的期望执行时间，例如：明天中午、2026-05-02</w:t>
+      </w:r>
+      <w:r>
+        <w:rPr>
+          <w:rStyle w:val="VerbatimChar"/>
+        </w:rPr>
+        <w:t xml:space="preserve"> 14:00",</w:t>
+      </w:r>
+      <w:r>
+        <w:br/>
+      </w:r>
+      <w:r>
+        <w:rPr>
+          <w:rStyle w:val="VerbatimChar"/>
+        </w:rPr>
+        <w:t xml:space="preserve">  "location": </w:t>
+      </w:r>
+      <w:r>
+        <w:rPr>
+          <w:rStyle w:val="VerbatimChar"/>
+          <w:rFonts w:hint="eastAsia"/>
+        </w:rPr>
+        <w:t xml:space="preserve">"任务相关的具体地点，例如：南区快递点、三舍",</w:t>
+      </w:r>
+      <w:r>
+        <w:br/>
+      </w:r>
+      <w:r>
+        <w:rPr>
+          <w:rStyle w:val="VerbatimChar"/>
+        </w:rPr>
+        <w:t xml:space="preserve">  "action": </w:t>
+      </w:r>
+      <w:r>
+        <w:rPr>
+          <w:rStyle w:val="VerbatimChar"/>
+          <w:rFonts w:hint="eastAsia"/>
+        </w:rPr>
+        <w:t xml:space="preserve">"具体的动作和对象，例如：拿大件快递、修电脑",</w:t>
+      </w:r>
+      <w:r>
+        <w:br/>
+      </w:r>
+      <w:r>
+        <w:rPr>
+          <w:rStyle w:val="VerbatimChar"/>
+        </w:rPr>
+        <w:t xml:space="preserve">  "reward": </w:t>
+      </w:r>
+      <w:r>
+        <w:rPr>
+          <w:rStyle w:val="VerbatimChar"/>
+          <w:rFonts w:hint="eastAsia"/>
+        </w:rPr>
+        <w:t xml:space="preserve">"报酬金额纯数字，例如：5、10.5",</w:t>
+      </w:r>
+      <w:r>
+        <w:br/>
+      </w:r>
+      <w:r>
+        <w:rPr>
+          <w:rStyle w:val="VerbatimChar"/>
+        </w:rPr>
+        <w:t xml:space="preserve">  "tags": </w:t>
+      </w:r>
+      <w:r>
+        <w:rPr>
+          <w:rStyle w:val="VerbatimChar"/>
+          <w:rFonts w:hint="eastAsia"/>
+        </w:rPr>
+        <w:t xml:space="preserve">["任务的分类标签，输出</w:t>
+      </w:r>
+      <w:r>
+        <w:rPr>
+          <w:rStyle w:val="VerbatimChar"/>
+        </w:rPr>
+        <w:t xml:space="preserve"> 1-2 </w:t>
+      </w:r>
+      <w:r>
+        <w:rPr>
+          <w:rStyle w:val="VerbatimChar"/>
+          <w:rFonts w:hint="eastAsia"/>
+        </w:rPr>
+        <w:t xml:space="preserve">个，例如：代拿快递、跑腿、技能互助"]</w:t>
+      </w:r>
+      <w:r>
+        <w:br/>
+      </w:r>
+      <w:r>
+        <w:rPr>
+          <w:rStyle w:val="VerbatimChar"/>
+        </w:rPr>
+        <w:t xml:space="preserve">}</w:t>
+      </w:r>
+      <w:r>
+        <w:br/>
+      </w:r>
+      <w:r>
+        <w:br/>
+      </w:r>
+      <w:r>
+        <w:rPr>
+          <w:rStyle w:val="VerbatimChar"/>
+        </w:rPr>
+        <w:t xml:space="preserve"># Examples</w:t>
+      </w:r>
+      <w:r>
+        <w:br/>
+      </w:r>
+      <w:r>
+        <w:rPr>
+          <w:rStyle w:val="VerbatimChar"/>
+        </w:rPr>
+        <w:t xml:space="preserve">User Input: </w:t>
+      </w:r>
+      <w:r>
+        <w:rPr>
+          <w:rStyle w:val="VerbatimChar"/>
+          <w:rFonts w:hint="eastAsia"/>
+        </w:rPr>
+        <w:t xml:space="preserve">"明天下午三点求个同学帮我把一个大箱子从南门搬到三舍，报酬一杯奶茶（约15元）"</w:t>
+      </w:r>
+      <w:r>
+        <w:br/>
+      </w:r>
+      <w:r>
+        <w:rPr>
+          <w:rStyle w:val="VerbatimChar"/>
+        </w:rPr>
+        <w:t xml:space="preserve">JSON Output: </w:t>
+      </w:r>
+      <w:r>
+        <w:br/>
+      </w:r>
+      <w:r>
+        <w:rPr>
+          <w:rStyle w:val="VerbatimChar"/>
+        </w:rPr>
+        <w:t xml:space="preserve">{</w:t>
+      </w:r>
+      <w:r>
+        <w:br/>
+      </w:r>
+      <w:r>
+        <w:rPr>
+          <w:rStyle w:val="VerbatimChar"/>
+        </w:rPr>
+        <w:t xml:space="preserve">  "time": </w:t>
+      </w:r>
+      <w:r>
+        <w:rPr>
+          <w:rStyle w:val="VerbatimChar"/>
+          <w:rFonts w:hint="eastAsia"/>
+        </w:rPr>
+        <w:t xml:space="preserve">"明天下午三点",</w:t>
+      </w:r>
+      <w:r>
+        <w:br/>
+      </w:r>
+      <w:r>
+        <w:rPr>
+          <w:rStyle w:val="VerbatimChar"/>
+        </w:rPr>
+        <w:t xml:space="preserve">  "location": </w:t>
+      </w:r>
+      <w:r>
+        <w:rPr>
+          <w:rStyle w:val="VerbatimChar"/>
+          <w:rFonts w:hint="eastAsia"/>
+        </w:rPr>
+        <w:t xml:space="preserve">"南门到三舍",</w:t>
+      </w:r>
+      <w:r>
+        <w:br/>
+      </w:r>
+      <w:r>
+        <w:rPr>
+          <w:rStyle w:val="VerbatimChar"/>
+        </w:rPr>
+        <w:t xml:space="preserve">  "action": </w:t>
+      </w:r>
+      <w:r>
+        <w:rPr>
+          <w:rStyle w:val="VerbatimChar"/>
+          <w:rFonts w:hint="eastAsia"/>
+        </w:rPr>
+        <w:t xml:space="preserve">"搬大箱子",</w:t>
+      </w:r>
+      <w:r>
+        <w:br/>
+      </w:r>
+      <w:r>
+        <w:rPr>
+          <w:rStyle w:val="VerbatimChar"/>
+        </w:rPr>
+        <w:t xml:space="preserve">  "reward": 15,</w:t>
+      </w:r>
+      <w:r>
+        <w:br/>
+      </w:r>
+      <w:r>
+        <w:rPr>
+          <w:rStyle w:val="VerbatimChar"/>
+        </w:rPr>
+        <w:t xml:space="preserve">  "tags": </w:t>
+      </w:r>
+      <w:r>
+        <w:rPr>
+          <w:rStyle w:val="VerbatimChar"/>
+          <w:rFonts w:hint="eastAsia"/>
+        </w:rPr>
+        <w:t xml:space="preserve">["体力帮办",</w:t>
+      </w:r>
+      <w:r>
+        <w:rPr>
+          <w:rStyle w:val="VerbatimChar"/>
+        </w:rPr>
+        <w:t xml:space="preserve"> </w:t>
+      </w:r>
+      <w:r>
+        <w:rPr>
+          <w:rStyle w:val="VerbatimChar"/>
+          <w:rFonts w:hint="eastAsia"/>
+        </w:rPr>
+        <w:t xml:space="preserve">"跑腿"]</w:t>
+      </w:r>
+      <w:r>
+        <w:br/>
+      </w:r>
+      <w:r>
+        <w:rPr>
+          <w:rStyle w:val="VerbatimChar"/>
+        </w:rPr>
+        <w:t xml:space="preserve">}</w:t>
+      </w:r>
+      <w:r>
+        <w:br/>
+      </w:r>
+      <w:r>
+        <w:br/>
+      </w:r>
+      <w:r>
+        <w:rPr>
+          <w:rStyle w:val="VerbatimChar"/>
+        </w:rPr>
+        <w:t xml:space="preserve">User Input: </w:t>
+      </w:r>
+      <w:r>
+        <w:rPr>
+          <w:rStyle w:val="VerbatimChar"/>
+          <w:rFonts w:hint="eastAsia"/>
+        </w:rPr>
+        <w:t xml:space="preserve">"有没有会装系统的，来男生寝室帮个忙，重谢50"</w:t>
+      </w:r>
+      <w:r>
+        <w:br/>
+      </w:r>
+      <w:r>
+        <w:rPr>
+          <w:rStyle w:val="VerbatimChar"/>
+        </w:rPr>
+        <w:t xml:space="preserve">JSON Output:</w:t>
+      </w:r>
+      <w:r>
+        <w:br/>
+      </w:r>
+      <w:r>
+        <w:rPr>
+          <w:rStyle w:val="VerbatimChar"/>
+        </w:rPr>
+        <w:t xml:space="preserve">{</w:t>
+      </w:r>
+      <w:r>
+        <w:br/>
+      </w:r>
+      <w:r>
+        <w:rPr>
+          <w:rStyle w:val="VerbatimChar"/>
+        </w:rPr>
+        <w:t xml:space="preserve">  "time": null,</w:t>
+      </w:r>
+      <w:r>
+        <w:br/>
+      </w:r>
+      <w:r>
+        <w:rPr>
+          <w:rStyle w:val="VerbatimChar"/>
+        </w:rPr>
+        <w:t xml:space="preserve">  "location": </w:t>
+      </w:r>
+      <w:r>
+        <w:rPr>
+          <w:rStyle w:val="VerbatimChar"/>
+          <w:rFonts w:hint="eastAsia"/>
+        </w:rPr>
+        <w:t xml:space="preserve">"男生寝室",</w:t>
+      </w:r>
+      <w:r>
+        <w:br/>
+      </w:r>
+      <w:r>
+        <w:rPr>
+          <w:rStyle w:val="VerbatimChar"/>
+        </w:rPr>
+        <w:t xml:space="preserve">  "action": </w:t>
+      </w:r>
+      <w:r>
+        <w:rPr>
+          <w:rStyle w:val="VerbatimChar"/>
+          <w:rFonts w:hint="eastAsia"/>
+        </w:rPr>
+        <w:t xml:space="preserve">"装系统",</w:t>
+      </w:r>
+      <w:r>
+        <w:br/>
+      </w:r>
+      <w:r>
+        <w:rPr>
+          <w:rStyle w:val="VerbatimChar"/>
+        </w:rPr>
+        <w:t xml:space="preserve">  "reward": 50,</w:t>
+      </w:r>
+      <w:r>
+        <w:br/>
+      </w:r>
+      <w:r>
+        <w:rPr>
+          <w:rStyle w:val="VerbatimChar"/>
+        </w:rPr>
+        <w:t xml:space="preserve">  "tags": </w:t>
+      </w:r>
+      <w:r>
+        <w:rPr>
+          <w:rStyle w:val="VerbatimChar"/>
+          <w:rFonts w:hint="eastAsia"/>
+        </w:rPr>
+        <w:t xml:space="preserve">["技能互助",</w:t>
+      </w:r>
+      <w:r>
+        <w:rPr>
+          <w:rStyle w:val="VerbatimChar"/>
+        </w:rPr>
+        <w:t xml:space="preserve"> </w:t>
+      </w:r>
+      <w:r>
+        <w:rPr>
+          <w:rStyle w:val="VerbatimChar"/>
+          <w:rFonts w:hint="eastAsia"/>
+        </w:rPr>
+        <w:t xml:space="preserve">"电脑维修"]</w:t>
+      </w:r>
+      <w:r>
+        <w:br/>
+      </w:r>
+      <w:r>
+        <w:rPr>
+          <w:rStyle w:val="VerbatimChar"/>
+        </w:rPr>
+        <w:t xml:space="preserve">}</w:t>
+      </w:r>
+      <w:r>
+        <w:br/>
+      </w:r>
+      <w:r>
+        <w:br/>
+      </w:r>
+      <w:r>
+        <w:rPr>
+          <w:rStyle w:val="VerbatimChar"/>
+        </w:rPr>
+        <w:t xml:space="preserve"># Task</w:t>
+      </w:r>
+      <w:r>
+        <w:br/>
+      </w:r>
+      <w:r>
+        <w:rPr>
+          <w:rStyle w:val="VerbatimChar"/>
+          <w:rFonts w:hint="eastAsia"/>
+        </w:rPr>
+        <w:t xml:space="preserve">现在，请解析以下用户输入，并仅返回</w:t>
+      </w:r>
+      <w:r>
+        <w:rPr>
+          <w:rStyle w:val="VerbatimChar"/>
+        </w:rPr>
+        <w:t xml:space="preserve"> JSON </w:t>
+      </w:r>
+      <w:r>
+        <w:rPr>
+          <w:rStyle w:val="VerbatimChar"/>
+          <w:rFonts w:hint="eastAsia"/>
+        </w:rPr>
+        <w:t xml:space="preserve">数据：</w:t>
+      </w:r>
+      <w:r>
+        <w:br/>
+      </w:r>
+      <w:r>
+        <w:rPr>
+          <w:rStyle w:val="VerbatimChar"/>
+        </w:rPr>
+        <w:t xml:space="preserve">User Input: {user_input}</w:t>
+      </w:r>
+    </w:p>
+    <w:bookmarkEnd w:id="11"/>
     <w:sectPr>
       <w:footnotePr>
         <w:numRestart w:val="eachSect"/>
@@ -636,8 +2440,123 @@
       </w:pPr>
     </w:lvl>
   </w:abstractNum>
+  <w:abstractNum w:abstractNumId="991">
+    <w:nsid w:val="0000A991"/>
+    <w:multiLevelType w:val="multilevel"/>
+    <w:lvl w:ilvl="0">
+      <w:numFmt w:val="bullet"/>
+      <w:lvlText w:val=""/>
+      <w:lvlJc w:val="left"/>
+      <w:pPr>
+        <w:ind w:left="720" w:hanging="360"/>
+      </w:pPr>
+      <w:rPr>
+        <w:rFonts w:ascii="Symbol" w:hAnsi="Symbol" w:cs="Symbol" w:hint="default"/>
+      </w:rPr>
+    </w:lvl>
+    <w:lvl w:ilvl="1">
+      <w:numFmt w:val="bullet"/>
+      <w:lvlText w:val="o"/>
+      <w:lvlJc w:val="left"/>
+      <w:pPr>
+        <w:ind w:left="1440" w:hanging="360"/>
+      </w:pPr>
+      <w:rPr>
+        <w:rFonts w:ascii="Courier New" w:hAnsi="Courier New" w:cs="Courier New" w:hint="default"/>
+      </w:rPr>
+    </w:lvl>
+    <w:lvl w:ilvl="2">
+      <w:numFmt w:val="bullet"/>
+      <w:lvlText w:val=""/>
+      <w:lvlJc w:val="left"/>
+      <w:pPr>
+        <w:ind w:left="2160" w:hanging="360"/>
+      </w:pPr>
+      <w:rPr>
+        <w:rFonts w:ascii="Wingdings" w:hAnsi="Wingdings" w:cs="Wingdings" w:hint="default"/>
+      </w:rPr>
+    </w:lvl>
+    <w:lvl w:ilvl="3">
+      <w:numFmt w:val="bullet"/>
+      <w:lvlText w:val=""/>
+      <w:lvlJc w:val="left"/>
+      <w:pPr>
+        <w:ind w:left="2880" w:hanging="360"/>
+      </w:pPr>
+      <w:rPr>
+        <w:rFonts w:ascii="Symbol" w:hAnsi="Symbol" w:cs="Symbol" w:hint="default"/>
+      </w:rPr>
+    </w:lvl>
+    <w:lvl w:ilvl="4">
+      <w:numFmt w:val="bullet"/>
+      <w:lvlText w:val="o"/>
+      <w:lvlJc w:val="left"/>
+      <w:pPr>
+        <w:ind w:left="3600" w:hanging="360"/>
+      </w:pPr>
+      <w:rPr>
+        <w:rFonts w:ascii="Courier New" w:hAnsi="Courier New" w:cs="Courier New" w:hint="default"/>
+      </w:rPr>
+    </w:lvl>
+    <w:lvl w:ilvl="5">
+      <w:numFmt w:val="bullet"/>
+      <w:lvlText w:val=""/>
+      <w:lvlJc w:val="left"/>
+      <w:pPr>
+        <w:ind w:left="4320" w:hanging="360"/>
+      </w:pPr>
+      <w:rPr>
+        <w:rFonts w:ascii="Wingdings" w:hAnsi="Wingdings" w:cs="Wingdings" w:hint="default"/>
+      </w:rPr>
+    </w:lvl>
+    <w:lvl w:ilvl="6">
+      <w:numFmt w:val="bullet"/>
+      <w:lvlText w:val=""/>
+      <w:lvlJc w:val="left"/>
+      <w:pPr>
+        <w:ind w:left="5040" w:hanging="360"/>
+      </w:pPr>
+      <w:rPr>
+        <w:rFonts w:ascii="Symbol" w:hAnsi="Symbol" w:cs="Symbol" w:hint="default"/>
+      </w:rPr>
+    </w:lvl>
+    <w:lvl w:ilvl="7">
+      <w:numFmt w:val="bullet"/>
+      <w:lvlText w:val="o"/>
+      <w:lvlJc w:val="left"/>
+      <w:pPr>
+        <w:ind w:left="5760" w:hanging="360"/>
+      </w:pPr>
+      <w:rPr>
+        <w:rFonts w:ascii="Courier New" w:hAnsi="Courier New" w:cs="Courier New" w:hint="default"/>
+      </w:rPr>
+    </w:lvl>
+    <w:lvl w:ilvl="8">
+      <w:numFmt w:val="bullet"/>
+      <w:lvlText w:val=""/>
+      <w:lvlJc w:val="left"/>
+      <w:pPr>
+        <w:ind w:left="6480" w:hanging="360"/>
+      </w:pPr>
+      <w:rPr>
+        <w:rFonts w:ascii="Wingdings" w:hAnsi="Wingdings" w:cs="Wingdings" w:hint="default"/>
+      </w:rPr>
+    </w:lvl>
+  </w:abstractNum>
   <w:num w:numId="1000">
     <w:abstractNumId w:val="990"/>
+  </w:num>
+  <w:num w:numId="1001">
+    <w:abstractNumId w:val="991"/>
+  </w:num>
+  <w:num w:numId="1002">
+    <w:abstractNumId w:val="991"/>
+  </w:num>
+  <w:num w:numId="1003">
+    <w:abstractNumId w:val="991"/>
+  </w:num>
+  <w:num w:numId="1004">
+    <w:abstractNumId w:val="991"/>
   </w:num>
 </w:numbering>
 </file>

</xml_diff>